<commit_message>
feat: WhatsApp FAB + social media links + menu pills + price block
</commit_message>
<xml_diff>
--- a/Imagenes/Chat-FRESCOLITO-Restaurante.docx
+++ b/Imagenes/Chat-FRESCOLITO-Restaurante.docx
@@ -44,7 +44,25 @@
           <w:sz w:val="22"/>
           <w:szCs w:val="22"/>
         </w:rPr>
-        <w:t>Fecha: 30 de Marzo de 2026</w:t>
+        <w:t xml:space="preserve">Fecha: 30 de </w:t>
+      </w:r>
+      <w:proofErr w:type="gramStart"/>
+      <w:r>
+        <w:rPr>
+          <w:color w:val="666666"/>
+          <w:sz w:val="22"/>
+          <w:szCs w:val="22"/>
+        </w:rPr>
+        <w:t>Marzo</w:t>
+      </w:r>
+      <w:proofErr w:type="gramEnd"/>
+      <w:r>
+        <w:rPr>
+          <w:color w:val="666666"/>
+          <w:sz w:val="22"/>
+          <w:szCs w:val="22"/>
+        </w:rPr>
+        <w:t xml:space="preserve"> de 2026</w:t>
       </w:r>
     </w:p>
     <w:p>
@@ -58,7 +76,25 @@
           <w:bCs/>
           <w:color w:val="3E2723"/>
         </w:rPr>
-        <w:t>Referencia de Diseño y Assets de Marca</w:t>
+        <w:t xml:space="preserve">Referencia de Diseño y </w:t>
+      </w:r>
+      <w:proofErr w:type="spellStart"/>
+      <w:r>
+        <w:rPr>
+          <w:b/>
+          <w:bCs/>
+          <w:color w:val="3E2723"/>
+        </w:rPr>
+        <w:t>Assets</w:t>
+      </w:r>
+      <w:proofErr w:type="spellEnd"/>
+      <w:r>
+        <w:rPr>
+          <w:b/>
+          <w:bCs/>
+          <w:color w:val="3E2723"/>
+        </w:rPr>
+        <w:t xml:space="preserve"> de Marca</w:t>
       </w:r>
     </w:p>
     <w:p>
@@ -77,7 +113,105 @@
         <w:rPr>
           <w:color w:val="333333"/>
         </w:rPr>
-        <w:t xml:space="preserve"> "Espera aun, te quiero pasar un modelo de una pagina web que visite y quisera que lo veas y lo analizes, a su ves quiero darte acceso para que darte las imagenes y el logo oficial de la marca FRESCOLITO RESTAURANTE y tambien veas los colores del logo y lo apliques a la pagina"</w:t>
+        <w:t xml:space="preserve"> "Espera aun, te quiero pasar un modelo de una </w:t>
+      </w:r>
+      <w:proofErr w:type="spellStart"/>
+      <w:r>
+        <w:rPr>
+          <w:color w:val="333333"/>
+        </w:rPr>
+        <w:t>pagina</w:t>
+      </w:r>
+      <w:proofErr w:type="spellEnd"/>
+      <w:r>
+        <w:rPr>
+          <w:color w:val="333333"/>
+        </w:rPr>
+        <w:t xml:space="preserve"> web que visite y </w:t>
+      </w:r>
+      <w:proofErr w:type="spellStart"/>
+      <w:r>
+        <w:rPr>
+          <w:color w:val="333333"/>
+        </w:rPr>
+        <w:t>quisera</w:t>
+      </w:r>
+      <w:proofErr w:type="spellEnd"/>
+      <w:r>
+        <w:rPr>
+          <w:color w:val="333333"/>
+        </w:rPr>
+        <w:t xml:space="preserve"> que lo veas y lo </w:t>
+      </w:r>
+      <w:proofErr w:type="spellStart"/>
+      <w:r>
+        <w:rPr>
+          <w:color w:val="333333"/>
+        </w:rPr>
+        <w:t>analizes</w:t>
+      </w:r>
+      <w:proofErr w:type="spellEnd"/>
+      <w:r>
+        <w:rPr>
+          <w:color w:val="333333"/>
+        </w:rPr>
+        <w:t xml:space="preserve">, a su </w:t>
+      </w:r>
+      <w:proofErr w:type="spellStart"/>
+      <w:r>
+        <w:rPr>
+          <w:color w:val="333333"/>
+        </w:rPr>
+        <w:t>ves</w:t>
+      </w:r>
+      <w:proofErr w:type="spellEnd"/>
+      <w:r>
+        <w:rPr>
+          <w:color w:val="333333"/>
+        </w:rPr>
+        <w:t xml:space="preserve"> quiero darte acceso para que darte las </w:t>
+      </w:r>
+      <w:proofErr w:type="spellStart"/>
+      <w:r>
+        <w:rPr>
+          <w:color w:val="333333"/>
+        </w:rPr>
+        <w:t>imagenes</w:t>
+      </w:r>
+      <w:proofErr w:type="spellEnd"/>
+      <w:r>
+        <w:rPr>
+          <w:color w:val="333333"/>
+        </w:rPr>
+        <w:t xml:space="preserve"> y el logo oficial de la marca FRESCOLITO RESTAURANTE y </w:t>
+      </w:r>
+      <w:proofErr w:type="spellStart"/>
+      <w:r>
+        <w:rPr>
+          <w:color w:val="333333"/>
+        </w:rPr>
+        <w:t>tambien</w:t>
+      </w:r>
+      <w:proofErr w:type="spellEnd"/>
+      <w:r>
+        <w:rPr>
+          <w:color w:val="333333"/>
+        </w:rPr>
+        <w:t xml:space="preserve"> veas los colores del logo y lo apliques a la </w:t>
+      </w:r>
+      <w:proofErr w:type="spellStart"/>
+      <w:r>
+        <w:rPr>
+          <w:color w:val="333333"/>
+        </w:rPr>
+        <w:t>pagina</w:t>
+      </w:r>
+      <w:proofErr w:type="spellEnd"/>
+      <w:r>
+        <w:rPr>
+          <w:color w:val="333333"/>
+        </w:rPr>
+        <w:t>"</w:t>
       </w:r>
     </w:p>
     <w:p>
@@ -145,31 +279,69 @@
         <w:spacing w:after="50"/>
       </w:pPr>
       <w:r>
-        <w:t>• Navbar con logo centrado, menú hamburguesa, botón 'Ordenar'</w:t>
-      </w:r>
-    </w:p>
-    <w:p>
-      <w:pPr>
-        <w:spacing w:after="50"/>
-      </w:pPr>
-      <w:r>
-        <w:t>• Hero section con CTA 'ORDENAR'</w:t>
-      </w:r>
-    </w:p>
-    <w:p>
-      <w:pPr>
-        <w:spacing w:after="50"/>
-      </w:pPr>
-      <w:r>
-        <w:t>• Sección 'Únete a la familia La Leña'</w:t>
-      </w:r>
-    </w:p>
-    <w:p>
-      <w:pPr>
-        <w:spacing w:after="50"/>
-      </w:pPr>
-      <w:r>
-        <w:t>• Sección Josper (método de cocina especial)</w:t>
+        <w:t xml:space="preserve">• </w:t>
+      </w:r>
+      <w:proofErr w:type="spellStart"/>
+      <w:r>
+        <w:t>Navbar</w:t>
+      </w:r>
+      <w:proofErr w:type="spellEnd"/>
+      <w:r>
+        <w:t xml:space="preserve"> con logo centrado, </w:t>
+      </w:r>
+      <w:proofErr w:type="gramStart"/>
+      <w:r>
+        <w:t>menú hamburguesa</w:t>
+      </w:r>
+      <w:proofErr w:type="gramEnd"/>
+      <w:r>
+        <w:t>, botón 'Ordenar'</w:t>
+      </w:r>
+    </w:p>
+    <w:p>
+      <w:pPr>
+        <w:spacing w:after="50"/>
+      </w:pPr>
+      <w:r>
+        <w:t xml:space="preserve">• Hero </w:t>
+      </w:r>
+      <w:proofErr w:type="spellStart"/>
+      <w:r>
+        <w:t>section</w:t>
+      </w:r>
+      <w:proofErr w:type="spellEnd"/>
+      <w:r>
+        <w:t xml:space="preserve"> con CTA 'ORDENAR'</w:t>
+      </w:r>
+    </w:p>
+    <w:p>
+      <w:pPr>
+        <w:spacing w:after="50"/>
+      </w:pPr>
+      <w:r>
+        <w:t xml:space="preserve">• Sección 'Únete a la familia </w:t>
+      </w:r>
+      <w:r>
+        <w:t>FRESCOLITO”</w:t>
+      </w:r>
+      <w:r>
+        <w:t>'</w:t>
+      </w:r>
+    </w:p>
+    <w:p>
+      <w:pPr>
+        <w:spacing w:after="50"/>
+      </w:pPr>
+      <w:r>
+        <w:t xml:space="preserve">• Sección </w:t>
+      </w:r>
+      <w:proofErr w:type="spellStart"/>
+      <w:r>
+        <w:t>Josper</w:t>
+      </w:r>
+      <w:proofErr w:type="spellEnd"/>
+      <w:r>
+        <w:t xml:space="preserve"> (método de cocina especial)</w:t>
       </w:r>
     </w:p>
     <w:p>
@@ -201,8 +373,29 @@
         <w:spacing w:after="100"/>
       </w:pPr>
       <w:r>
-        <w:t>Colores La Leña: Rojo (#c41e3a), fondo blanco, tipografías Abril Fatface + Lexend Deca</w:t>
-      </w:r>
+        <w:t xml:space="preserve">Colores La Leña: Rojo (#c41e3a), fondo blanco, tipografías Abril </w:t>
+      </w:r>
+      <w:proofErr w:type="spellStart"/>
+      <w:r>
+        <w:t>Fatface</w:t>
+      </w:r>
+      <w:proofErr w:type="spellEnd"/>
+      <w:r>
+        <w:t xml:space="preserve"> + </w:t>
+      </w:r>
+      <w:proofErr w:type="spellStart"/>
+      <w:r>
+        <w:t>Lexend</w:t>
+      </w:r>
+      <w:proofErr w:type="spellEnd"/>
+      <w:r>
+        <w:t xml:space="preserve"> </w:t>
+      </w:r>
+      <w:proofErr w:type="spellStart"/>
+      <w:r>
+        <w:t>Deca</w:t>
+      </w:r>
+      <w:proofErr w:type="spellEnd"/>
     </w:p>
     <w:p>
       <w:pPr>
@@ -614,16 +807,26 @@
       <w:pPr>
         <w:spacing w:after="50"/>
       </w:pPr>
-      <w:r>
-        <w:t>Primary (Amarillo vibrante): #FDB913</w:t>
-      </w:r>
-    </w:p>
-    <w:p>
-      <w:pPr>
-        <w:spacing w:after="50"/>
-      </w:pPr>
-      <w:r>
-        <w:t>Primary Hover (Amarillo oscuro): #F39C12</w:t>
+      <w:proofErr w:type="spellStart"/>
+      <w:r>
+        <w:t>Primary</w:t>
+      </w:r>
+      <w:proofErr w:type="spellEnd"/>
+      <w:r>
+        <w:t xml:space="preserve"> (Amarillo vibrante): #FDB913</w:t>
+      </w:r>
+    </w:p>
+    <w:p>
+      <w:pPr>
+        <w:spacing w:after="50"/>
+      </w:pPr>
+      <w:proofErr w:type="spellStart"/>
+      <w:r>
+        <w:t>Primary</w:t>
+      </w:r>
+      <w:proofErr w:type="spellEnd"/>
+      <w:r>
+        <w:t xml:space="preserve"> Hover (Amarillo oscuro): #F39C12</w:t>
       </w:r>
     </w:p>
     <w:p>
@@ -638,8 +841,13 @@
       <w:pPr>
         <w:spacing w:after="50"/>
       </w:pPr>
-      <w:r>
-        <w:t>Mid (Marrón medio): #8D6E63</w:t>
+      <w:proofErr w:type="spellStart"/>
+      <w:r>
+        <w:t>Mid</w:t>
+      </w:r>
+      <w:proofErr w:type="spellEnd"/>
+      <w:r>
+        <w:t xml:space="preserve"> (Marrón medio): #8D6E63</w:t>
       </w:r>
     </w:p>
     <w:p>
@@ -654,8 +862,13 @@
       <w:pPr>
         <w:spacing w:after="50"/>
       </w:pPr>
-      <w:r>
-        <w:t>Background (Blanco): #FFFFFF</w:t>
+      <w:proofErr w:type="spellStart"/>
+      <w:r>
+        <w:t>Background</w:t>
+      </w:r>
+      <w:proofErr w:type="spellEnd"/>
+      <w:r>
+        <w:t xml:space="preserve"> (Blanco): #FFFFFF</w:t>
       </w:r>
     </w:p>
     <w:p>
@@ -693,7 +906,31 @@
         <w:t>1. index.html - Inicio</w:t>
       </w:r>
       <w:r>
-        <w:t>: Barra anuncio, Navbar, Hero, Platos Destacados, Nuestra Historia, Promo Marino, Galería preview, Footer</w:t>
+        <w:t xml:space="preserve">: Barra anuncio, </w:t>
+      </w:r>
+      <w:proofErr w:type="spellStart"/>
+      <w:r>
+        <w:t>Navbar</w:t>
+      </w:r>
+      <w:proofErr w:type="spellEnd"/>
+      <w:r>
+        <w:t xml:space="preserve">, Hero, Platos Destacados, Nuestra Historia, </w:t>
+      </w:r>
+      <w:proofErr w:type="spellStart"/>
+      <w:r>
+        <w:t>Promo</w:t>
+      </w:r>
+      <w:proofErr w:type="spellEnd"/>
+      <w:r>
+        <w:t xml:space="preserve"> Marino, Galería </w:t>
+      </w:r>
+      <w:proofErr w:type="spellStart"/>
+      <w:r>
+        <w:t>preview</w:t>
+      </w:r>
+      <w:proofErr w:type="spellEnd"/>
+      <w:r>
+        <w:t>, Footer</w:t>
       </w:r>
     </w:p>
     <w:p>
@@ -708,7 +945,23 @@
         <w:t>2. menu.html - Menú</w:t>
       </w:r>
       <w:r>
-        <w:t>: Header, Pestañas (A la Carta/Promos), Grid de platos con foto, nombre, precio</w:t>
+        <w:t>: Header, Pestañas (A la Carta/</w:t>
+      </w:r>
+      <w:proofErr w:type="spellStart"/>
+      <w:r>
+        <w:t>Promos</w:t>
+      </w:r>
+      <w:proofErr w:type="spellEnd"/>
+      <w:r>
+        <w:t xml:space="preserve">), </w:t>
+      </w:r>
+      <w:proofErr w:type="spellStart"/>
+      <w:r>
+        <w:t>Grid</w:t>
+      </w:r>
+      <w:proofErr w:type="spellEnd"/>
+      <w:r>
+        <w:t xml:space="preserve"> de platos con foto, nombre, precio</w:t>
       </w:r>
     </w:p>
     <w:p>
@@ -738,8 +991,21 @@
         <w:t>4. galeria.html - Galería</w:t>
       </w:r>
       <w:r>
-        <w:t>: Header, Grid de fotos, Lightbox</w:t>
-      </w:r>
+        <w:t xml:space="preserve">: Header, </w:t>
+      </w:r>
+      <w:proofErr w:type="spellStart"/>
+      <w:r>
+        <w:t>Grid</w:t>
+      </w:r>
+      <w:proofErr w:type="spellEnd"/>
+      <w:r>
+        <w:t xml:space="preserve"> de fotos, </w:t>
+      </w:r>
+      <w:proofErr w:type="spellStart"/>
+      <w:r>
+        <w:t>Lightbox</w:t>
+      </w:r>
+      <w:proofErr w:type="spellEnd"/>
     </w:p>
     <w:p>
       <w:pPr>
@@ -753,7 +1019,15 @@
         <w:t>5. contacto.html - Contacto</w:t>
       </w:r>
       <w:r>
-        <w:t>: Formulario, Mapa Iquitos (Leaflet.js), Info contacto</w:t>
+        <w:t xml:space="preserve">: Formulario, Mapa Iquitos (Leaflet.js), </w:t>
+      </w:r>
+      <w:proofErr w:type="spellStart"/>
+      <w:r>
+        <w:t>Info</w:t>
+      </w:r>
+      <w:proofErr w:type="spellEnd"/>
+      <w:r>
+        <w:t xml:space="preserve"> contacto</w:t>
       </w:r>
     </w:p>
     <w:p>
@@ -807,7 +1081,15 @@
         <w:spacing w:after="50"/>
       </w:pPr>
       <w:r>
-        <w:t>• Google Fonts: Playfair Display + Lato</w:t>
+        <w:t xml:space="preserve">• Google Fonts: Playfair </w:t>
+      </w:r>
+      <w:proofErr w:type="spellStart"/>
+      <w:r>
+        <w:t>Display</w:t>
+      </w:r>
+      <w:proofErr w:type="spellEnd"/>
+      <w:r>
+        <w:t xml:space="preserve"> + Lato</w:t>
       </w:r>
     </w:p>
     <w:p>
@@ -823,7 +1105,15 @@
         <w:spacing w:after="100"/>
       </w:pPr>
       <w:r>
-        <w:t>• npx serve: Servidor local</w:t>
+        <w:t xml:space="preserve">• </w:t>
+      </w:r>
+      <w:proofErr w:type="spellStart"/>
+      <w:r>
+        <w:t>npx</w:t>
+      </w:r>
+      <w:proofErr w:type="spellEnd"/>
+      <w:r>
+        <w:t xml:space="preserve"> serve: Servidor local</w:t>
       </w:r>
     </w:p>
     <w:p>
@@ -854,8 +1144,21 @@
         <w:spacing w:after="50"/>
       </w:pPr>
       <w:r>
-        <w:t>2. npx serve site/public</w:t>
-      </w:r>
+        <w:t xml:space="preserve">2. </w:t>
+      </w:r>
+      <w:proofErr w:type="spellStart"/>
+      <w:r>
+        <w:t>npx</w:t>
+      </w:r>
+      <w:proofErr w:type="spellEnd"/>
+      <w:r>
+        <w:t xml:space="preserve"> serve site/</w:t>
+      </w:r>
+      <w:proofErr w:type="spellStart"/>
+      <w:r>
+        <w:t>public</w:t>
+      </w:r>
+      <w:proofErr w:type="spellEnd"/>
     </w:p>
     <w:p>
       <w:pPr>
@@ -886,7 +1189,15 @@
         <w:spacing w:after="50"/>
       </w:pPr>
       <w:r>
-        <w:t>Paso 1: Configurar Stitch MCP con API key (Manual)</w:t>
+        <w:t xml:space="preserve">Paso 1: Configurar Stitch MCP con API </w:t>
+      </w:r>
+      <w:proofErr w:type="spellStart"/>
+      <w:r>
+        <w:t>key</w:t>
+      </w:r>
+      <w:proofErr w:type="spellEnd"/>
+      <w:r>
+        <w:t xml:space="preserve"> (Manual)</w:t>
       </w:r>
     </w:p>
     <w:p>
@@ -902,39 +1213,161 @@
         <w:spacing w:after="50"/>
       </w:pPr>
       <w:r>
-        <w:t>Paso 3: Generar .stitch/DESIGN.md (skill design-md)</w:t>
-      </w:r>
-    </w:p>
-    <w:p>
-      <w:pPr>
-        <w:spacing w:after="50"/>
-      </w:pPr>
-      <w:r>
-        <w:t>Paso 4: Crear .stitch/SITE.md (skill stitch-loop)</w:t>
-      </w:r>
-    </w:p>
-    <w:p>
-      <w:pPr>
-        <w:spacing w:after="50"/>
-      </w:pPr>
-      <w:r>
-        <w:t>Paso 5: Generar index.html (skill stitch-design → stitch-loop)</w:t>
-      </w:r>
-    </w:p>
-    <w:p>
-      <w:pPr>
-        <w:spacing w:after="50"/>
-      </w:pPr>
-      <w:r>
-        <w:t>Paso 6: Generar menu.html (skill enhance-prompt → stitch-loop)</w:t>
-      </w:r>
-    </w:p>
-    <w:p>
-      <w:pPr>
-        <w:spacing w:after="50"/>
-      </w:pPr>
-      <w:r>
-        <w:t>Paso 7: Generar páginas restantes (skill stitch-loop)</w:t>
+        <w:t xml:space="preserve">Paso 3: </w:t>
+      </w:r>
+      <w:proofErr w:type="gramStart"/>
+      <w:r>
+        <w:t>Generar .</w:t>
+      </w:r>
+      <w:proofErr w:type="spellStart"/>
+      <w:proofErr w:type="gramEnd"/>
+      <w:r>
+        <w:t>stitch</w:t>
+      </w:r>
+      <w:proofErr w:type="spellEnd"/>
+      <w:r>
+        <w:t>/DESIGN.md (</w:t>
+      </w:r>
+      <w:proofErr w:type="spellStart"/>
+      <w:r>
+        <w:t>skill</w:t>
+      </w:r>
+      <w:proofErr w:type="spellEnd"/>
+      <w:r>
+        <w:t xml:space="preserve"> </w:t>
+      </w:r>
+      <w:proofErr w:type="spellStart"/>
+      <w:r>
+        <w:t>design-md</w:t>
+      </w:r>
+      <w:proofErr w:type="spellEnd"/>
+      <w:r>
+        <w:t>)</w:t>
+      </w:r>
+    </w:p>
+    <w:p>
+      <w:pPr>
+        <w:spacing w:after="50"/>
+      </w:pPr>
+      <w:r>
+        <w:t xml:space="preserve">Paso 4: </w:t>
+      </w:r>
+      <w:proofErr w:type="gramStart"/>
+      <w:r>
+        <w:t>Crear .</w:t>
+      </w:r>
+      <w:proofErr w:type="spellStart"/>
+      <w:proofErr w:type="gramEnd"/>
+      <w:r>
+        <w:t>stitch</w:t>
+      </w:r>
+      <w:proofErr w:type="spellEnd"/>
+      <w:r>
+        <w:t>/SITE.md (</w:t>
+      </w:r>
+      <w:proofErr w:type="spellStart"/>
+      <w:r>
+        <w:t>skill</w:t>
+      </w:r>
+      <w:proofErr w:type="spellEnd"/>
+      <w:r>
+        <w:t xml:space="preserve"> </w:t>
+      </w:r>
+      <w:proofErr w:type="spellStart"/>
+      <w:r>
+        <w:t>stitch-loop</w:t>
+      </w:r>
+      <w:proofErr w:type="spellEnd"/>
+      <w:r>
+        <w:t>)</w:t>
+      </w:r>
+    </w:p>
+    <w:p>
+      <w:pPr>
+        <w:spacing w:after="50"/>
+      </w:pPr>
+      <w:r>
+        <w:t>Paso 5: Generar index.html (</w:t>
+      </w:r>
+      <w:proofErr w:type="spellStart"/>
+      <w:r>
+        <w:t>skill</w:t>
+      </w:r>
+      <w:proofErr w:type="spellEnd"/>
+      <w:r>
+        <w:t xml:space="preserve"> </w:t>
+      </w:r>
+      <w:proofErr w:type="spellStart"/>
+      <w:r>
+        <w:t>stitch-design</w:t>
+      </w:r>
+      <w:proofErr w:type="spellEnd"/>
+      <w:r>
+        <w:t xml:space="preserve"> → </w:t>
+      </w:r>
+      <w:proofErr w:type="spellStart"/>
+      <w:r>
+        <w:t>stitch-loop</w:t>
+      </w:r>
+      <w:proofErr w:type="spellEnd"/>
+      <w:r>
+        <w:t>)</w:t>
+      </w:r>
+    </w:p>
+    <w:p>
+      <w:pPr>
+        <w:spacing w:after="50"/>
+      </w:pPr>
+      <w:r>
+        <w:t>Paso 6: Generar menu.html (</w:t>
+      </w:r>
+      <w:proofErr w:type="spellStart"/>
+      <w:r>
+        <w:t>skill</w:t>
+      </w:r>
+      <w:proofErr w:type="spellEnd"/>
+      <w:r>
+        <w:t xml:space="preserve"> </w:t>
+      </w:r>
+      <w:proofErr w:type="spellStart"/>
+      <w:r>
+        <w:t>enhance-prompt</w:t>
+      </w:r>
+      <w:proofErr w:type="spellEnd"/>
+      <w:r>
+        <w:t xml:space="preserve"> → </w:t>
+      </w:r>
+      <w:proofErr w:type="spellStart"/>
+      <w:r>
+        <w:t>stitch-loop</w:t>
+      </w:r>
+      <w:proofErr w:type="spellEnd"/>
+      <w:r>
+        <w:t>)</w:t>
+      </w:r>
+    </w:p>
+    <w:p>
+      <w:pPr>
+        <w:spacing w:after="50"/>
+      </w:pPr>
+      <w:r>
+        <w:t>Paso 7: Generar páginas restantes (</w:t>
+      </w:r>
+      <w:proofErr w:type="spellStart"/>
+      <w:r>
+        <w:t>skill</w:t>
+      </w:r>
+      <w:proofErr w:type="spellEnd"/>
+      <w:r>
+        <w:t xml:space="preserve"> </w:t>
+      </w:r>
+      <w:proofErr w:type="spellStart"/>
+      <w:r>
+        <w:t>stitch-loop</w:t>
+      </w:r>
+      <w:proofErr w:type="spellEnd"/>
+      <w:r>
+        <w:t>)</w:t>
       </w:r>
     </w:p>
     <w:p>
@@ -975,7 +1408,35 @@
         <w:rPr>
           <w:color w:val="333333"/>
         </w:rPr>
-        <w:t xml:space="preserve"> "Solo setup por ahora" → "Explica más primero" → "Imprime el archivo de este chat que tenemos ahora en un word. antes de empezar a maquinar todo. quiero primero el archivo completo de este chat"</w:t>
+        <w:t xml:space="preserve"> "Solo </w:t>
+      </w:r>
+      <w:proofErr w:type="spellStart"/>
+      <w:r>
+        <w:rPr>
+          <w:color w:val="333333"/>
+        </w:rPr>
+        <w:t>setup</w:t>
+      </w:r>
+      <w:proofErr w:type="spellEnd"/>
+      <w:r>
+        <w:rPr>
+          <w:color w:val="333333"/>
+        </w:rPr>
+        <w:t xml:space="preserve"> por ahora" → "Explica más primero" → "Imprime el archivo de este chat que tenemos ahora en un </w:t>
+      </w:r>
+      <w:proofErr w:type="spellStart"/>
+      <w:r>
+        <w:rPr>
+          <w:color w:val="333333"/>
+        </w:rPr>
+        <w:t>word</w:t>
+      </w:r>
+      <w:proofErr w:type="spellEnd"/>
+      <w:r>
+        <w:rPr>
+          <w:color w:val="333333"/>
+        </w:rPr>
+        <w:t>. antes de empezar a maquinar todo. quiero primero el archivo completo de este chat"</w:t>
       </w:r>
     </w:p>
     <w:p>
@@ -1082,20 +1543,34 @@
         </w:rPr>
         <w:t xml:space="preserve">API Key Stitch: </w:t>
       </w:r>
-      <w:r>
-        <w:t>AQ.Ab8RN6Lja04YvdpORi04WQfe201GFyHts3Y0qsLusrd9s070zw</w:t>
-      </w:r>
-    </w:p>
-    <w:p>
-      <w:pPr>
-        <w:spacing w:after="50"/>
-      </w:pPr>
-      <w:r>
-        <w:rPr>
-          <w:b/>
-          <w:bCs/>
-        </w:rPr>
-        <w:t xml:space="preserve">Assets: </w:t>
+      <w:proofErr w:type="gramStart"/>
+      <w:r>
+        <w:t>AQ.Ab</w:t>
+      </w:r>
+      <w:proofErr w:type="gramEnd"/>
+      <w:r>
+        <w:t>8RN6Lja04YvdpORi04WQfe201GFyHts3Y0qsLusrd9s070zw</w:t>
+      </w:r>
+    </w:p>
+    <w:p>
+      <w:pPr>
+        <w:spacing w:after="50"/>
+      </w:pPr>
+      <w:proofErr w:type="spellStart"/>
+      <w:r>
+        <w:rPr>
+          <w:b/>
+          <w:bCs/>
+        </w:rPr>
+        <w:t>Assets</w:t>
+      </w:r>
+      <w:proofErr w:type="spellEnd"/>
+      <w:r>
+        <w:rPr>
+          <w:b/>
+          <w:bCs/>
+        </w:rPr>
+        <w:t xml:space="preserve">: </w:t>
       </w:r>
       <w:r>
         <w:t>C:\Users\adm\Desktop\FRESCOLITO DESARROLLO\</w:t>
@@ -1135,15 +1610,48 @@
       <w:pPr>
         <w:spacing w:after="50"/>
       </w:pPr>
-      <w:r>
-        <w:rPr>
-          <w:b/>
-          <w:bCs/>
-        </w:rPr>
-        <w:t xml:space="preserve">Skills instaladas: </w:t>
-      </w:r>
-      <w:r>
-        <w:t>~\.agents\skills\ (7 skills)</w:t>
+      <w:proofErr w:type="spellStart"/>
+      <w:r>
+        <w:rPr>
+          <w:b/>
+          <w:bCs/>
+        </w:rPr>
+        <w:t>Skills</w:t>
+      </w:r>
+      <w:proofErr w:type="spellEnd"/>
+      <w:r>
+        <w:rPr>
+          <w:b/>
+          <w:bCs/>
+        </w:rPr>
+        <w:t xml:space="preserve"> instaladas: </w:t>
+      </w:r>
+      <w:r>
+        <w:t>~\.</w:t>
+      </w:r>
+      <w:proofErr w:type="spellStart"/>
+      <w:r>
+        <w:t>agents</w:t>
+      </w:r>
+      <w:proofErr w:type="spellEnd"/>
+      <w:r>
+        <w:t>\</w:t>
+      </w:r>
+      <w:proofErr w:type="spellStart"/>
+      <w:r>
+        <w:t>skills</w:t>
+      </w:r>
+      <w:proofErr w:type="spellEnd"/>
+      <w:r>
+        <w:t xml:space="preserve">\ (7 </w:t>
+      </w:r>
+      <w:proofErr w:type="spellStart"/>
+      <w:r>
+        <w:t>skills</w:t>
+      </w:r>
+      <w:proofErr w:type="spellEnd"/>
+      <w:r>
+        <w:t>)</w:t>
       </w:r>
     </w:p>
     <w:p>
@@ -1158,7 +1666,15 @@
         <w:t xml:space="preserve">Fecha del chat: </w:t>
       </w:r>
       <w:r>
-        <w:t>30 de Marzo de 2026</w:t>
+        <w:t xml:space="preserve">30 de </w:t>
+      </w:r>
+      <w:proofErr w:type="gramStart"/>
+      <w:r>
+        <w:t>Marzo</w:t>
+      </w:r>
+      <w:proofErr w:type="gramEnd"/>
+      <w:r>
+        <w:t xml:space="preserve"> de 2026</w:t>
       </w:r>
     </w:p>
     <w:sectPr>

</xml_diff>